<commit_message>
Actividad 4.1: pide comprobacion del Paso 4 y los dos casos de tituloDe en el Paso 5
- Paso 4 ahora pide verificar el campo tituloVideojuego con curl y captura
- Paso 5 pide test del caso existe y del caso 404 para tituloDe, no solo uno
- Plantilla docx actualizada con la captura del Paso 4 y "los cuatro tests"
</commit_message>
<xml_diff>
--- a/docs/tema4/plantillas/Actividad_4_1_AD_Plantilla.docx
+++ b/docs/tema4/plantillas/Actividad_4_1_AD_Plantilla.docx
@@ -349,7 +349,7 @@
                 <w:sz w:val="20"/>
                 <w:szCs w:val="20"/>
               </w:rPr>
-              <w:t xml:space="preserve">Este documento relleno: la captura del Paso 1, las respuestas del Paso 2 y el Paso 3, la captura del Paso 5, y la pregunta final.</w:t>
+              <w:t xml:space="preserve">Este documento relleno: la captura del Paso 1, las respuestas del Paso 2 y el Paso 3, la captura del Paso 4, la captura del Paso 5, y la pregunta final.</w:t>
             </w:r>
           </w:p>
         </w:tc>
@@ -1187,7 +1187,7 @@
           <w:sz w:val="26"/>
           <w:szCs w:val="26"/>
         </w:rPr>
-        <w:t xml:space="preserve">Paso 5 — Prueba del componente aislado</w:t>
+        <w:t xml:space="preserve">Paso 4 — Un segundo método</w:t>
       </w:r>
     </w:p>
     <w:p>
@@ -1257,7 +1257,147 @@
                 <w:sz w:val="20"/>
                 <w:szCs w:val="20"/>
               </w:rPr>
-              <w:t xml:space="preserve">📸 Los tres tests en verde</w:t>
+              <w:t xml:space="preserve">📸 La respuesta de /resumen mostrando el campo tituloVideojuego</w:t>
+            </w:r>
+          </w:p>
+        </w:tc>
+      </w:tr>
+      <w:tr>
+        <w:trPr>
+          <w:trHeight w:val="2400"/>
+        </w:trPr>
+        <w:tc>
+          <w:tcPr>
+            <w:tcW w:type="dxa" w:w="9638"/>
+            <w:tcBorders>
+              <w:top w:val="single" w:color="E0E0E0" w:sz="4"/>
+              <w:left w:val="single" w:color="E0E0E0" w:sz="4"/>
+              <w:bottom w:val="single" w:color="E0E0E0" w:sz="4"/>
+              <w:right w:val="single" w:color="E0E0E0" w:sz="4"/>
+            </w:tcBorders>
+            <w:shd w:fill="FAFAFA" w:val="clear"/>
+            <w:tcMar>
+              <w:top w:type="dxa" w:w="80"/>
+              <w:left w:type="dxa" w:w="160"/>
+              <w:bottom w:type="dxa" w:w="80"/>
+              <w:right w:type="dxa" w:w="160"/>
+            </w:tcMar>
+          </w:tcPr>
+          <w:p>
+            <w:pPr>
+              <w:jc w:val="center"/>
+            </w:pPr>
+            <w:r>
+              <w:rPr>
+                <w:rFonts w:ascii="Arial" w:cs="Arial" w:eastAsia="Arial" w:hAnsi="Arial"/>
+                <w:i/>
+                <w:iCs/>
+                <w:color w:val="757575"/>
+                <w:sz w:val="20"/>
+                <w:szCs w:val="20"/>
+              </w:rPr>
+              <w:t xml:space="preserve">[Pega aquí la captura de pantalla]</w:t>
+            </w:r>
+          </w:p>
+        </w:tc>
+      </w:tr>
+    </w:tbl>
+    <w:p>
+      <w:pPr>
+        <w:spacing w:after="200"/>
+      </w:pPr>
+    </w:p>
+    <w:p>
+      <w:r>
+        <w:br w:type="page"/>
+      </w:r>
+    </w:p>
+    <w:p>
+      <w:pPr>
+        <w:shd w:fill="C62828" w:val="clear"/>
+        <w:spacing w:after="0" w:before="320"/>
+        <w:ind w:left="200" w:right="200"/>
+      </w:pPr>
+      <w:r>
+        <w:rPr>
+          <w:rFonts w:ascii="Arial" w:cs="Arial" w:eastAsia="Arial" w:hAnsi="Arial"/>
+          <w:b/>
+          <w:bCs/>
+          <w:color w:val="FFFFFF"/>
+          <w:sz w:val="26"/>
+          <w:szCs w:val="26"/>
+        </w:rPr>
+        <w:t xml:space="preserve">Paso 5 — Prueba del componente aislado</w:t>
+      </w:r>
+    </w:p>
+    <w:p>
+      <w:pPr>
+        <w:spacing w:after="80"/>
+      </w:pPr>
+    </w:p>
+    <w:p>
+      <w:pPr>
+        <w:pBdr>
+          <w:bottom w:val="single" w:color="E64A19" w:sz="4" w:space="1"/>
+        </w:pBdr>
+        <w:spacing w:after="120" w:before="240"/>
+      </w:pPr>
+      <w:r>
+        <w:rPr>
+          <w:rFonts w:ascii="Arial" w:cs="Arial" w:eastAsia="Arial" w:hAnsi="Arial"/>
+          <w:b/>
+          <w:bCs/>
+          <w:color w:val="C62828"/>
+          <w:sz w:val="24"/>
+          <w:szCs w:val="24"/>
+        </w:rPr>
+        <w:t xml:space="preserve">Captura</w:t>
+      </w:r>
+    </w:p>
+    <w:tbl>
+      <w:tblPr>
+        <w:tblW w:type="dxa" w:w="9638"/>
+        <w:tblBorders>
+          <w:top w:val="single" w:color="auto" w:sz="4"/>
+          <w:left w:val="single" w:color="auto" w:sz="4"/>
+          <w:bottom w:val="single" w:color="auto" w:sz="4"/>
+          <w:right w:val="single" w:color="auto" w:sz="4"/>
+          <w:insideH w:val="single" w:color="auto" w:sz="4"/>
+          <w:insideV w:val="single" w:color="auto" w:sz="4"/>
+        </w:tblBorders>
+      </w:tblPr>
+      <w:tblGrid>
+        <w:gridCol w:w="9638"/>
+      </w:tblGrid>
+      <w:tr>
+        <w:tc>
+          <w:tcPr>
+            <w:tcW w:type="dxa" w:w="9638"/>
+            <w:tcBorders>
+              <w:top w:val="none" w:color="FFFFFF" w:sz="0"/>
+              <w:left w:val="none" w:color="FFFFFF" w:sz="0"/>
+              <w:bottom w:val="none" w:color="FFFFFF" w:sz="0"/>
+              <w:right w:val="none" w:color="FFFFFF" w:sz="0"/>
+            </w:tcBorders>
+            <w:shd w:fill="C62828" w:val="clear"/>
+            <w:tcMar>
+              <w:top w:type="dxa" w:w="80"/>
+              <w:left w:type="dxa" w:w="160"/>
+              <w:bottom w:type="dxa" w:w="80"/>
+              <w:right w:type="dxa" w:w="160"/>
+            </w:tcMar>
+          </w:tcPr>
+          <w:p>
+            <w:r>
+              <w:rPr>
+                <w:rFonts w:ascii="Arial" w:cs="Arial" w:eastAsia="Arial" w:hAnsi="Arial"/>
+                <w:b/>
+                <w:bCs/>
+                <w:color w:val="FFFFFF"/>
+                <w:sz w:val="20"/>
+                <w:szCs w:val="20"/>
+              </w:rPr>
+              <w:t xml:space="preserve">📸 Los cuatro tests en verde</w:t>
             </w:r>
           </w:p>
         </w:tc>

</xml_diff>